<commit_message>
Fecha del documento actualizada, archivos temporales eliminados
</commit_message>
<xml_diff>
--- a/BD/ProgramaIncidencias.docx
+++ b/BD/ProgramaIncidencias.docx
@@ -16911,7 +16911,7 @@
                               <w:tag w:val=""/>
                               <w:id w:val="-1063724354"/>
                               <w:dataBinding w:prefixMappings="xmlns:ns0='http://schemas.microsoft.com/office/2006/coverPageProps' " w:xpath="/ns0:CoverPageProperties[1]/ns0:PublishDate[1]" w:storeItemID="{55AF091B-3C7A-41E3-B477-F2FDAA23CFDA}"/>
-                              <w:date w:fullDate="2025-11-25T00:00:00Z">
+                              <w:date>
                                 <w:dateFormat w:val="d 'de' MMMM 'de' yyyy"/>
                                 <w:lid w:val="es-ES"/>
                                 <w:storeMappedDataAs w:val="dateTime"/>
@@ -16930,7 +16930,37 @@
                                   <w:rPr>
                                     <w:color w:val="7F7F7F" w:themeColor="text1" w:themeTint="80"/>
                                   </w:rPr>
-                                  <w:t>25 de noviembre de 2025</w:t>
+                                  <w:t>2</w:t>
+                                </w:r>
+                                <w:r>
+                                  <w:rPr>
+                                    <w:color w:val="7F7F7F" w:themeColor="text1" w:themeTint="80"/>
+                                  </w:rPr>
+                                  <w:t>2</w:t>
+                                </w:r>
+                                <w:r>
+                                  <w:rPr>
+                                    <w:color w:val="7F7F7F" w:themeColor="text1" w:themeTint="80"/>
+                                  </w:rPr>
+                                  <w:t xml:space="preserve"> d</w:t>
+                                </w:r>
+                                <w:r>
+                                  <w:rPr>
+                                    <w:color w:val="7F7F7F" w:themeColor="text1" w:themeTint="80"/>
+                                  </w:rPr>
+                                  <w:t>e febrero</w:t>
+                                </w:r>
+                                <w:r>
+                                  <w:rPr>
+                                    <w:color w:val="7F7F7F" w:themeColor="text1" w:themeTint="80"/>
+                                  </w:rPr>
+                                  <w:t xml:space="preserve"> de 202</w:t>
+                                </w:r>
+                                <w:r>
+                                  <w:rPr>
+                                    <w:color w:val="7F7F7F" w:themeColor="text1" w:themeTint="80"/>
+                                  </w:rPr>
+                                  <w:t>6</w:t>
                                 </w:r>
                               </w:p>
                             </w:sdtContent>
@@ -16984,7 +17014,7 @@
                         <w:tag w:val=""/>
                         <w:id w:val="-1063724354"/>
                         <w:dataBinding w:prefixMappings="xmlns:ns0='http://schemas.microsoft.com/office/2006/coverPageProps' " w:xpath="/ns0:CoverPageProperties[1]/ns0:PublishDate[1]" w:storeItemID="{55AF091B-3C7A-41E3-B477-F2FDAA23CFDA}"/>
-                        <w:date w:fullDate="2025-11-25T00:00:00Z">
+                        <w:date>
                           <w:dateFormat w:val="d 'de' MMMM 'de' yyyy"/>
                           <w:lid w:val="es-ES"/>
                           <w:storeMappedDataAs w:val="dateTime"/>
@@ -17003,7 +17033,37 @@
                             <w:rPr>
                               <w:color w:val="7F7F7F" w:themeColor="text1" w:themeTint="80"/>
                             </w:rPr>
-                            <w:t>25 de noviembre de 2025</w:t>
+                            <w:t>2</w:t>
+                          </w:r>
+                          <w:r>
+                            <w:rPr>
+                              <w:color w:val="7F7F7F" w:themeColor="text1" w:themeTint="80"/>
+                            </w:rPr>
+                            <w:t>2</w:t>
+                          </w:r>
+                          <w:r>
+                            <w:rPr>
+                              <w:color w:val="7F7F7F" w:themeColor="text1" w:themeTint="80"/>
+                            </w:rPr>
+                            <w:t xml:space="preserve"> d</w:t>
+                          </w:r>
+                          <w:r>
+                            <w:rPr>
+                              <w:color w:val="7F7F7F" w:themeColor="text1" w:themeTint="80"/>
+                            </w:rPr>
+                            <w:t>e febrero</w:t>
+                          </w:r>
+                          <w:r>
+                            <w:rPr>
+                              <w:color w:val="7F7F7F" w:themeColor="text1" w:themeTint="80"/>
+                            </w:rPr>
+                            <w:t xml:space="preserve"> de 202</w:t>
+                          </w:r>
+                          <w:r>
+                            <w:rPr>
+                              <w:color w:val="7F7F7F" w:themeColor="text1" w:themeTint="80"/>
+                            </w:rPr>
+                            <w:t>6</w:t>
                           </w:r>
                         </w:p>
                       </w:sdtContent>
@@ -19309,7 +19369,7 @@
 
 <file path=customXml/item1.xml><?xml version="1.0" encoding="utf-8"?>
 <CoverPageProperties xmlns="http://schemas.microsoft.com/office/2006/coverPageProps">
-  <PublishDate>2025-11-25T00:00:00</PublishDate>
+  <PublishDate>22 de febrero de 2026</PublishDate>
   <Abstract/>
   <CompanyAddress>IES Pere Maria Orts</CompanyAddress>
   <CompanyPhone/>

</xml_diff>